<commit_message>
docs: auditoria completa e atualizacao geral da documentacao do sistema (03/10/2026)
</commit_message>
<xml_diff>
--- a/DOCUMENTACAO_ESTRUTURA_CORE_PLANOS_LUAN.docx
+++ b/DOCUMENTACAO_ESTRUTURA_CORE_PLANOS_LUAN.docx
@@ -1829,16 +1829,8 @@
             </w:tcMar>
           </w:tcPr>
           <w:p>
-            <w:pPr>
-              <w:spacing w:after="0"/>
-            </w:pPr>
             <w:r>
-              <w:rPr>
-                <w:rFonts w:ascii="Calibri" w:hAnsi="Calibri"/>
-                <w:color w:val="333333"/>
-                <w:sz w:val="19"/>
-              </w:rPr>
-              <w:t>85KB</w:t>
+              <w:t>95KB</w:t>
             </w:r>
           </w:p>
         </w:tc>
@@ -1854,16 +1846,8 @@
             </w:tcMar>
           </w:tcPr>
           <w:p>
-            <w:pPr>
-              <w:spacing w:after="0"/>
-            </w:pPr>
             <w:r>
-              <w:rPr>
-                <w:rFonts w:ascii="Calibri" w:hAnsi="Calibri"/>
-                <w:color w:val="333333"/>
-                <w:sz w:val="19"/>
-              </w:rPr>
-              <w:t>Gerenciador SQLite em WAL, connection_scope, CRUD, migrações e retenção</w:t>
+              <w:t>Gerenciador SQLite em WAL, connection_scope, confer?ncia mensal, regra da pasta do m?s, CRUD, migra??es e reten??o</w:t>
             </w:r>
           </w:p>
         </w:tc>
@@ -1931,16 +1915,8 @@
             </w:tcMar>
           </w:tcPr>
           <w:p>
-            <w:pPr>
-              <w:spacing w:after="0"/>
-            </w:pPr>
             <w:r>
-              <w:rPr>
-                <w:rFonts w:ascii="Calibri" w:hAnsi="Calibri"/>
-                <w:color w:val="333333"/>
-                <w:sz w:val="19"/>
-              </w:rPr>
-              <w:t>Detecção inteligente da última aula gerada por contexto</w:t>
+              <w:t>Detec??o inteligente da ?ltima aula trabalhada via DOCX e progresso_aulas</w:t>
             </w:r>
           </w:p>
         </w:tc>
@@ -5991,25 +5967,8 @@
             </w:tcMar>
           </w:tcPr>
           <w:p>
-            <w:pPr>
-              <w:spacing w:after="0"/>
-            </w:pPr>
             <w:r>
-              <w:rPr>
-                <w:rFonts w:ascii="Calibri" w:hAnsi="Calibri"/>
-                <w:b/>
-                <w:color w:val="1B365D"/>
-                <w:sz w:val="20"/>
-              </w:rPr>
-              <w:t xml:space="preserve">STATUS DOS TESTES (23/09/2026): </w:t>
-            </w:r>
-            <w:r>
-              <w:rPr>
-                <w:rFonts w:ascii="Calibri" w:hAnsi="Calibri"/>
-                <w:color w:val="333333"/>
-                <w:sz w:val="20"/>
-              </w:rPr>
-              <w:t>800 testes aprovados com sucesso total (800 passed, 25 skipped). Todos os módulos de rotas CDP, EJA, Word final, cadastro, higienizador, IA e calendário estão 100% validados.</w:t>
+              <w:t>STATUS DOS TESTES (03/10/2026): 853 testes automatizados coletados (828 aprovados, 25 ignorados, 0 falhas)</w:t>
             </w:r>
           </w:p>
         </w:tc>

</xml_diff>